<commit_message>
Redraw figures 6 and 9 and add Citi Bike's own approach and section links to the report
</commit_message>
<xml_diff>
--- a/report/final/citibike-report-editable.docx
+++ b/report/final/citibike-report-editable.docx
@@ -32,18 +32,33 @@
         <w:pStyle w:val="FirstParagraph"/>
       </w:pPr>
       <w:r>
-        <w:t>On a workday, Citi Bike members start about 9,400 trips in the 08:00 hour alone, most of them from homes in Brooklyn, the East Village and the Upper West Side to offices in Midtown and Lower Manhattan, and ride back in the evening. The stations they leave run out of bikes and the ones they ride to run out of free docks, so the next rider either finds no bike or has nowhere to return one. Citi Bike, run by Lyft for the City of New York, corrects this by moving bikes with trucks, vans and cargo bikes, mostly at night, about 2,500 bikes a day by its own reports. Every bike moved costs staff time and fuel, and a move made in the wrong place costs the same while preventing nothing.</w:t>
-      </w:r>
-    </w:p>
-    <w:p>
-      <w:pPr>
-        <w:pStyle w:val="BodyText"/>
+        <w:t>On a workday, Citi Bike members start about 9,400 trips in the 08:00 hour alone, most of them from homes in Brooklyn, the East Village and the Upper West Side to offices in Midtown and Lower Manhattan, and ride back in the evening. The stations they leave run out of bikes and the ones they ride to run out of free docks, so the next rider either finds no bike or has nowhere to return one. Citi Bike, run by Lyft for the City of New York, corrects this by moving bikes back against the flow, about 2,500 a day by its own reports. Every bike moved costs staff time and fuel, and a move made in the wrong place costs the same while preventing nothing.</w:t>
+      </w:r>
+    </w:p>
+    <w:p>
+      <w:pPr>
+        <w:pStyle w:val="FirstParagraph"/>
       </w:pPr>
       <w:r>
         <w:rPr>
           <w:b/>
           <w:bCs/>
         </w:rPr>
+        <w:t>How Citi Bike does it today.</w:t>
+      </w:r>
+      <w:r>
+        <w:t xml:space="preserve"> Citi Bike names four tools (Citi Bike n.d.). Vans and box trucks, run by a team working around the clock, move bikes in bulk over longer distances. Bike trains, e-bikes towing a trailer of 12 to 16 bikes, handle short moves on narrow streets. Valets stand at the busiest stations at rush hour and take in bikes beyond the docks, so a full station keeps accepting riders. And Bike Angels pays members in points, redeemable for ride credit or a free membership, for taking bikes from full stations to empty ones (Chung et al. 2018). Citi Bike publishes how many bikes it moves each month, but not which stations it fills, to what level, or how many riders still find a station empty. So its own plan cannot be scored directly. We measure our schedules against two simple benchmarks instead, never moving a bike and resetting every station to half full each night, and compare their workload with the moves Citi Bike reports.</w:t>
+      </w:r>
+    </w:p>
+    <w:p>
+      <w:pPr>
+        <w:pStyle w:val="BodyText"/>
+      </w:pPr>
+      <w:r>
+        <w:rPr>
+          <w:b/>
+          <w:bCs/>
+        </w:rPr>
         <w:t>Our question:</w:t>
       </w:r>
       <w:r>
@@ -63,7 +78,7 @@
         <w:pStyle w:val="BodyText"/>
       </w:pPr>
       <w:r>
-        <w:t xml:space="preserve">In short: the obvious rule, resetting every station to half full each night, moves 5,900 bikes a day and still turns away 4,700 riders. Our recommended schedule gives each station a target band drawn from its last ten comparable days and leaves stations inside it alone. Each night it moves about 1,700 bikes, taking first the moves that prevent the most shortages, and at 14:00 vans move about 800 more at the 100 stations that need it most. On the test year it turns away 1,779 riders a day (1.5 per 100 trips) and moves 2,549 bikes, about what Citi Bike reports moving. Against the half-full reset that is 62% fewer shortages with 57% fewer bikes moved. A quarter of the shortages left sit at seven stations whose daily swing is larger than their </w:t>
+        <w:t xml:space="preserve">In short: the simplest benchmark, resetting every station to half full each night, moves 5,900 bikes a day and still turns away 4,700 riders. Our recommended schedule gives each station a target band drawn from its last ten comparable days and leaves stations inside it alone. Each night it moves about 1,700 bikes, taking first the moves that prevent the most shortages, and at 14:00 vans move about 800 more at the 100 stations that need it most. On the test year it turns away 1,779 riders a day (1.5 per 100 trips) and moves 2,549 bikes, about what Citi Bike reports moving. Against the half-full reset that is 62% fewer shortages with 57% fewer bikes moved. A quarter of the shortages left sit at seven stations whose daily swing is larger than their </w:t>
       </w:r>
       <w:proofErr w:type="gramStart"/>
       <w:r>
@@ -81,11 +96,18 @@
       <w:bookmarkStart w:id="1" w:name="data-assumptions-and-what-is-missing"/>
       <w:bookmarkEnd w:id="0"/>
       <w:r>
-        <w:lastRenderedPageBreak/>
         <w:br/>
       </w:r>
       <w:r>
         <w:t>2. Data, assumptions and what is missing</w:t>
+      </w:r>
+    </w:p>
+    <w:p>
+      <w:pPr>
+        <w:pStyle w:val="FirstParagraph"/>
+      </w:pPr>
+      <w:r>
+        <w:t>Everything that follows rests on public data, so first what that data covers and what it leaves out.</w:t>
       </w:r>
     </w:p>
     <w:tbl>
@@ -466,7 +488,6 @@
           <w:b/>
           <w:bCs/>
         </w:rPr>
-        <w:lastRenderedPageBreak/>
         <w:t>Dock counts are from one day.</w:t>
       </w:r>
       <w:r>
@@ -507,50 +528,17 @@
         <w:pStyle w:val="FirstParagraph"/>
       </w:pPr>
       <w:r>
+        <w:t>To plan the vans we first need to know when bikes pile up and where. Three views answer that: the hour of the day, the station and the neighbourhood.</w:t>
+      </w:r>
+    </w:p>
+    <w:p>
+      <w:pPr>
+        <w:pStyle w:val="FirstParagraph"/>
+      </w:pPr>
+      <w:r>
         <w:rPr>
           <w:noProof/>
         </w:rPr>
-        <w:drawing>
-          <wp:inline distT="0" distB="0" distL="0" distR="0" wp14:anchorId="5495D299" wp14:editId="12BD249B">
-            <wp:extent cx="5334000" cy="2229134"/>
-            <wp:effectExtent l="0" t="0" r="0" b="0"/>
-            <wp:docPr id="12" name="Picture"/>
-            <wp:cNvGraphicFramePr/>
-            <a:graphic xmlns:a="http://schemas.openxmlformats.org/drawingml/2006/main">
-              <a:graphicData uri="http://schemas.openxmlformats.org/drawingml/2006/picture">
-                <pic:pic xmlns:pic="http://schemas.openxmlformats.org/drawingml/2006/picture">
-                  <pic:nvPicPr>
-                    <pic:cNvPr id="13" name="Picture" descr="figures/fig1-daily-rhythm.png"/>
-                    <pic:cNvPicPr>
-                      <a:picLocks noChangeAspect="1" noChangeArrowheads="1"/>
-                    </pic:cNvPicPr>
-                  </pic:nvPicPr>
-                  <pic:blipFill>
-                    <a:blip r:embed="rId5"/>
-                    <a:stretch>
-                      <a:fillRect/>
-                    </a:stretch>
-                  </pic:blipFill>
-                  <pic:spPr bwMode="auto">
-                    <a:xfrm>
-                      <a:off x="0" y="0"/>
-                      <a:ext cx="5334000" cy="2229134"/>
-                    </a:xfrm>
-                    <a:prstGeom prst="rect">
-                      <a:avLst/>
-                    </a:prstGeom>
-                    <a:noFill/>
-                    <a:ln w="9525">
-                      <a:noFill/>
-                      <a:headEnd/>
-                      <a:tailEnd/>
-                    </a:ln>
-                  </pic:spPr>
-                </pic:pic>
-              </a:graphicData>
-            </a:graphic>
-          </wp:inline>
-        </w:drawing>
       </w:r>
     </w:p>
     <w:p>
@@ -581,47 +569,6 @@
         <w:rPr>
           <w:noProof/>
         </w:rPr>
-        <w:drawing>
-          <wp:inline distT="0" distB="0" distL="0" distR="0" wp14:anchorId="7D320CCC" wp14:editId="0421DAAF">
-            <wp:extent cx="3947160" cy="2886729"/>
-            <wp:effectExtent l="0" t="0" r="0" b="0"/>
-            <wp:docPr id="15" name="Picture"/>
-            <wp:cNvGraphicFramePr/>
-            <a:graphic xmlns:a="http://schemas.openxmlformats.org/drawingml/2006/main">
-              <a:graphicData uri="http://schemas.openxmlformats.org/drawingml/2006/picture">
-                <pic:pic xmlns:pic="http://schemas.openxmlformats.org/drawingml/2006/picture">
-                  <pic:nvPicPr>
-                    <pic:cNvPr id="16" name="Picture" descr="figures/fig2-rush-map.png"/>
-                    <pic:cNvPicPr>
-                      <a:picLocks noChangeAspect="1" noChangeArrowheads="1"/>
-                    </pic:cNvPicPr>
-                  </pic:nvPicPr>
-                  <pic:blipFill>
-                    <a:blip r:embed="rId6"/>
-                    <a:stretch>
-                      <a:fillRect/>
-                    </a:stretch>
-                  </pic:blipFill>
-                  <pic:spPr bwMode="auto">
-                    <a:xfrm>
-                      <a:off x="0" y="0"/>
-                      <a:ext cx="3947160" cy="2886729"/>
-                    </a:xfrm>
-                    <a:prstGeom prst="rect">
-                      <a:avLst/>
-                    </a:prstGeom>
-                    <a:noFill/>
-                    <a:ln w="9525">
-                      <a:noFill/>
-                      <a:headEnd/>
-                      <a:tailEnd/>
-                    </a:ln>
-                  </pic:spPr>
-                </pic:pic>
-              </a:graphicData>
-            </a:graphic>
-          </wp:inline>
-        </w:drawing>
       </w:r>
     </w:p>
     <w:p>
@@ -633,7 +580,6 @@
           <w:i/>
           <w:iCs/>
         </w:rPr>
-        <w:lastRenderedPageBreak/>
         <w:t>Figure 2. Each station’s average net flow (bikes arriving minus bikes leaving) over the workday morning rush (07:00 to 10:00) and evening rush (16:00 to 19:00), development year. The colour scale stops at 15 bikes so smaller stations still show.</w:t>
       </w:r>
     </w:p>
@@ -653,47 +599,6 @@
         <w:rPr>
           <w:noProof/>
         </w:rPr>
-        <w:drawing>
-          <wp:inline distT="0" distB="0" distL="0" distR="0" wp14:anchorId="21CF26B2" wp14:editId="230C3A35">
-            <wp:extent cx="4480560" cy="2674961"/>
-            <wp:effectExtent l="0" t="0" r="0" b="0"/>
-            <wp:docPr id="18" name="Picture"/>
-            <wp:cNvGraphicFramePr/>
-            <a:graphic xmlns:a="http://schemas.openxmlformats.org/drawingml/2006/main">
-              <a:graphicData uri="http://schemas.openxmlformats.org/drawingml/2006/picture">
-                <pic:pic xmlns:pic="http://schemas.openxmlformats.org/drawingml/2006/picture">
-                  <pic:nvPicPr>
-                    <pic:cNvPr id="19" name="Picture" descr="figures/fig3-neighbourhood-clock.png"/>
-                    <pic:cNvPicPr>
-                      <a:picLocks noChangeAspect="1" noChangeArrowheads="1"/>
-                    </pic:cNvPicPr>
-                  </pic:nvPicPr>
-                  <pic:blipFill>
-                    <a:blip r:embed="rId7"/>
-                    <a:stretch>
-                      <a:fillRect/>
-                    </a:stretch>
-                  </pic:blipFill>
-                  <pic:spPr bwMode="auto">
-                    <a:xfrm>
-                      <a:off x="0" y="0"/>
-                      <a:ext cx="4480560" cy="2674961"/>
-                    </a:xfrm>
-                    <a:prstGeom prst="rect">
-                      <a:avLst/>
-                    </a:prstGeom>
-                    <a:noFill/>
-                    <a:ln w="9525">
-                      <a:noFill/>
-                      <a:headEnd/>
-                      <a:tailEnd/>
-                    </a:ln>
-                  </pic:spPr>
-                </pic:pic>
-              </a:graphicData>
-            </a:graphic>
-          </wp:inline>
-        </w:drawing>
       </w:r>
     </w:p>
     <w:p>
@@ -723,7 +628,6 @@
       <w:bookmarkStart w:id="3" w:name="can-it-be-planned-the-night-before"/>
       <w:bookmarkEnd w:id="2"/>
       <w:r>
-        <w:lastRenderedPageBreak/>
         <w:t>4. Can it be planned the night before?</w:t>
       </w:r>
     </w:p>
@@ -732,50 +636,17 @@
         <w:pStyle w:val="FirstParagraph"/>
       </w:pPr>
       <w:r>
+        <w:t>Section 3 shows a large imbalance with a clear daily rhythm. A schedule set the night before only helps if tomorrow looks like the days before it, so this section tests how well a station’s past predicts its next day.</w:t>
+      </w:r>
+    </w:p>
+    <w:p>
+      <w:pPr>
+        <w:pStyle w:val="FirstParagraph"/>
+      </w:pPr>
+      <w:r>
         <w:rPr>
           <w:noProof/>
         </w:rPr>
-        <w:drawing>
-          <wp:inline distT="0" distB="0" distL="0" distR="0" wp14:anchorId="2721B7EE" wp14:editId="5399F389">
-            <wp:extent cx="2240280" cy="2067951"/>
-            <wp:effectExtent l="0" t="0" r="0" b="0"/>
-            <wp:docPr id="22" name="Picture"/>
-            <wp:cNvGraphicFramePr/>
-            <a:graphic xmlns:a="http://schemas.openxmlformats.org/drawingml/2006/main">
-              <a:graphicData uri="http://schemas.openxmlformats.org/drawingml/2006/picture">
-                <pic:pic xmlns:pic="http://schemas.openxmlformats.org/drawingml/2006/picture">
-                  <pic:nvPicPr>
-                    <pic:cNvPr id="23" name="Picture" descr="figures/fig4-habit.png"/>
-                    <pic:cNvPicPr>
-                      <a:picLocks noChangeAspect="1" noChangeArrowheads="1"/>
-                    </pic:cNvPicPr>
-                  </pic:nvPicPr>
-                  <pic:blipFill>
-                    <a:blip r:embed="rId8"/>
-                    <a:stretch>
-                      <a:fillRect/>
-                    </a:stretch>
-                  </pic:blipFill>
-                  <pic:spPr bwMode="auto">
-                    <a:xfrm>
-                      <a:off x="0" y="0"/>
-                      <a:ext cx="2240280" cy="2067951"/>
-                    </a:xfrm>
-                    <a:prstGeom prst="rect">
-                      <a:avLst/>
-                    </a:prstGeom>
-                    <a:noFill/>
-                    <a:ln w="9525">
-                      <a:noFill/>
-                      <a:headEnd/>
-                      <a:tailEnd/>
-                    </a:ln>
-                  </pic:spPr>
-                </pic:pic>
-              </a:graphicData>
-            </a:graphic>
-          </wp:inline>
-        </w:drawing>
       </w:r>
       <w:r>
         <w:t xml:space="preserve"> </w:t>
@@ -784,47 +655,6 @@
         <w:rPr>
           <w:noProof/>
         </w:rPr>
-        <w:drawing>
-          <wp:inline distT="0" distB="0" distL="0" distR="0" wp14:anchorId="5420B2F3" wp14:editId="057DE880">
-            <wp:extent cx="2240280" cy="2067951"/>
-            <wp:effectExtent l="0" t="0" r="0" b="0"/>
-            <wp:docPr id="25" name="Picture"/>
-            <wp:cNvGraphicFramePr/>
-            <a:graphic xmlns:a="http://schemas.openxmlformats.org/drawingml/2006/main">
-              <a:graphicData uri="http://schemas.openxmlformats.org/drawingml/2006/picture">
-                <pic:pic xmlns:pic="http://schemas.openxmlformats.org/drawingml/2006/picture">
-                  <pic:nvPicPr>
-                    <pic:cNvPr id="26" name="Picture" descr="figures/fig5-single-day.png"/>
-                    <pic:cNvPicPr>
-                      <a:picLocks noChangeAspect="1" noChangeArrowheads="1"/>
-                    </pic:cNvPicPr>
-                  </pic:nvPicPr>
-                  <pic:blipFill>
-                    <a:blip r:embed="rId9"/>
-                    <a:stretch>
-                      <a:fillRect/>
-                    </a:stretch>
-                  </pic:blipFill>
-                  <pic:spPr bwMode="auto">
-                    <a:xfrm>
-                      <a:off x="0" y="0"/>
-                      <a:ext cx="2240280" cy="2067951"/>
-                    </a:xfrm>
-                    <a:prstGeom prst="rect">
-                      <a:avLst/>
-                    </a:prstGeom>
-                    <a:noFill/>
-                    <a:ln w="9525">
-                      <a:noFill/>
-                      <a:headEnd/>
-                      <a:tailEnd/>
-                    </a:ln>
-                  </pic:spPr>
-                </pic:pic>
-              </a:graphicData>
-            </a:graphic>
-          </wp:inline>
-        </w:drawing>
       </w:r>
     </w:p>
     <w:p>
@@ -844,7 +674,7 @@
         <w:pStyle w:val="BodyText"/>
       </w:pPr>
       <w:r>
-        <w:t>A schedule built from past days only works if the imbalance repeats. On average it does: a station’s morning flow in odd weeks matches the even weeks at a correlation of 0.998 (Figure 4). A single day is noisier. Against the average of the ten workdays before, a day’s morning flow correlates at 0.90 (Figure 5), and the median station-day misses that average by 1.6 bikes. A schedule set the night before will be off at most stations by a little, and at the big ones by a lot.</w:t>
+        <w:t>On average it does: a station’s morning flow in odd weeks matches the even weeks at a correlation of 0.998 (Figure 4). A single day is noisier. Against the average of the ten workdays before, a day’s morning flow correlates at 0.90 (Figure 5), and the median station-day misses that average by 1.6 bikes. A schedule set the night before will be off at most stations by a little, and at the big ones by a lot.</w:t>
       </w:r>
     </w:p>
     <w:p>
@@ -870,7 +700,7 @@
         <w:pStyle w:val="FirstParagraph"/>
       </w:pPr>
       <w:r>
-        <w:t>A linear regression of the log of each day’s trips on the weather in riding hours (07:00 to 21:00) and the calendar, fitted on the development year, explains 87% of the day-to-day variation in the test year, with a median error of 11% (Figure 6).</w:t>
+        <w:t>Stations repeat their own pattern, but the total number of riders still swings with the weather and the season. Before setting station targets, we check how much of that a simple model can forecast. A linear regression of the log of each day’s trips on the weather in riding hours (07:00 to 21:00) and the calendar, fitted on the development year, explains 87% of the day-to-day variation in the test year, with a median error of 11% (Figure 6).</w:t>
       </w:r>
     </w:p>
     <w:p>
@@ -881,48 +711,6 @@
         <w:rPr>
           <w:noProof/>
         </w:rPr>
-        <w:lastRenderedPageBreak/>
-        <w:drawing>
-          <wp:inline distT="0" distB="0" distL="0" distR="0" wp14:anchorId="4A4D3045" wp14:editId="0E41A2A2">
-            <wp:extent cx="2613660" cy="2028512"/>
-            <wp:effectExtent l="0" t="0" r="0" b="0"/>
-            <wp:docPr id="29" name="Picture"/>
-            <wp:cNvGraphicFramePr/>
-            <a:graphic xmlns:a="http://schemas.openxmlformats.org/drawingml/2006/main">
-              <a:graphicData uri="http://schemas.openxmlformats.org/drawingml/2006/picture">
-                <pic:pic xmlns:pic="http://schemas.openxmlformats.org/drawingml/2006/picture">
-                  <pic:nvPicPr>
-                    <pic:cNvPr id="30" name="Picture" descr="figures/fig6-demand-model.png"/>
-                    <pic:cNvPicPr>
-                      <a:picLocks noChangeAspect="1" noChangeArrowheads="1"/>
-                    </pic:cNvPicPr>
-                  </pic:nvPicPr>
-                  <pic:blipFill>
-                    <a:blip r:embed="rId10"/>
-                    <a:stretch>
-                      <a:fillRect/>
-                    </a:stretch>
-                  </pic:blipFill>
-                  <pic:spPr bwMode="auto">
-                    <a:xfrm>
-                      <a:off x="0" y="0"/>
-                      <a:ext cx="2613660" cy="2028512"/>
-                    </a:xfrm>
-                    <a:prstGeom prst="rect">
-                      <a:avLst/>
-                    </a:prstGeom>
-                    <a:noFill/>
-                    <a:ln w="9525">
-                      <a:noFill/>
-                      <a:headEnd/>
-                      <a:tailEnd/>
-                    </a:ln>
-                  </pic:spPr>
-                </pic:pic>
-              </a:graphicData>
-            </a:graphic>
-          </wp:inline>
-        </w:drawing>
       </w:r>
       <w:r>
         <w:t xml:space="preserve"> </w:t>
@@ -931,47 +719,6 @@
         <w:rPr>
           <w:noProof/>
         </w:rPr>
-        <w:drawing>
-          <wp:inline distT="0" distB="0" distL="0" distR="0" wp14:anchorId="0708D2FB" wp14:editId="7892AE83">
-            <wp:extent cx="2613660" cy="2028512"/>
-            <wp:effectExtent l="0" t="0" r="0" b="0"/>
-            <wp:docPr id="32" name="Picture"/>
-            <wp:cNvGraphicFramePr/>
-            <a:graphic xmlns:a="http://schemas.openxmlformats.org/drawingml/2006/main">
-              <a:graphicData uri="http://schemas.openxmlformats.org/drawingml/2006/picture">
-                <pic:pic xmlns:pic="http://schemas.openxmlformats.org/drawingml/2006/picture">
-                  <pic:nvPicPr>
-                    <pic:cNvPr id="33" name="Picture" descr="figures/fig7-demand-effects.png"/>
-                    <pic:cNvPicPr>
-                      <a:picLocks noChangeAspect="1" noChangeArrowheads="1"/>
-                    </pic:cNvPicPr>
-                  </pic:nvPicPr>
-                  <pic:blipFill>
-                    <a:blip r:embed="rId11"/>
-                    <a:stretch>
-                      <a:fillRect/>
-                    </a:stretch>
-                  </pic:blipFill>
-                  <pic:spPr bwMode="auto">
-                    <a:xfrm>
-                      <a:off x="0" y="0"/>
-                      <a:ext cx="2613660" cy="2028512"/>
-                    </a:xfrm>
-                    <a:prstGeom prst="rect">
-                      <a:avLst/>
-                    </a:prstGeom>
-                    <a:noFill/>
-                    <a:ln w="9525">
-                      <a:noFill/>
-                      <a:headEnd/>
-                      <a:tailEnd/>
-                    </a:ln>
-                  </pic:spPr>
-                </pic:pic>
-              </a:graphicData>
-            </a:graphic>
-          </wp:inline>
-        </w:drawing>
       </w:r>
     </w:p>
     <w:p>
@@ -983,7 +730,7 @@
           <w:i/>
           <w:iCs/>
         </w:rPr>
-        <w:t>Figure 6 (left). Trips per day and the model’s prediction; the model is fitted left of the dashed line and scored right of it. Figure 7 (right). Each factor’s effect on a day’s trips, with 95% confidence intervals.</w:t>
+        <w:t>Figure 6 (left). Every day of the test year: the trips the model predicted against the trips that happened. Dashed: a perfect forecast. Figure 7 (right). Each factor’s effect on a day’s trips, with 95% confidence intervals.</w:t>
       </w:r>
     </w:p>
     <w:p>
@@ -999,7 +746,7 @@
         <w:pStyle w:val="BodyText"/>
       </w:pPr>
       <w:r>
-        <w:t xml:space="preserve">Each station’s starting level comes from its own last 10 comparable days, workdays or weekends. For each past day we record two numbers: the </w:t>
+        <w:t xml:space="preserve">The forecast says how busy tomorrow will be, not where bikes will run out. For that we go back to each station’s own recent days. Each station’s starting level comes from its own last 10 comparable days, workdays or weekends. For each past day we record two numbers: the </w:t>
       </w:r>
       <w:r>
         <w:rPr>
@@ -1366,7 +1113,7 @@
         <w:pStyle w:val="FirstParagraph"/>
       </w:pPr>
       <w:r>
-        <w:t>We replay every trip of the test year through all 2,470 stations, once per schedule. A rider who finds the start station empty is turned away and their trip is struck from the destination’s arrivals; a rider who finds the end station full is counted as turned away too. The schedules:</w:t>
+        <w:t>With a band for every station and every setting fixed on the development year, the schedules can now be scored on the year held back. We replay every trip of the test year through all 2,470 stations, once per schedule. A rider who finds the start station empty is turned away and their trip is struck from the destination’s arrivals; a rider who finds the end station full is counted as turned away too. The schedules:</w:t>
       </w:r>
     </w:p>
     <w:p>
@@ -1499,48 +1246,6 @@
         <w:rPr>
           <w:noProof/>
         </w:rPr>
-        <w:lastRenderedPageBreak/>
-        <w:drawing>
-          <wp:inline distT="0" distB="0" distL="0" distR="0" wp14:anchorId="2E3DD4CC" wp14:editId="15195DAB">
-            <wp:extent cx="5334000" cy="2308746"/>
-            <wp:effectExtent l="0" t="0" r="0" b="0"/>
-            <wp:docPr id="36" name="Picture"/>
-            <wp:cNvGraphicFramePr/>
-            <a:graphic xmlns:a="http://schemas.openxmlformats.org/drawingml/2006/main">
-              <a:graphicData uri="http://schemas.openxmlformats.org/drawingml/2006/picture">
-                <pic:pic xmlns:pic="http://schemas.openxmlformats.org/drawingml/2006/picture">
-                  <pic:nvPicPr>
-                    <pic:cNvPr id="37" name="Picture" descr="figures/fig8-one-day.png"/>
-                    <pic:cNvPicPr>
-                      <a:picLocks noChangeAspect="1" noChangeArrowheads="1"/>
-                    </pic:cNvPicPr>
-                  </pic:nvPicPr>
-                  <pic:blipFill>
-                    <a:blip r:embed="rId12"/>
-                    <a:stretch>
-                      <a:fillRect/>
-                    </a:stretch>
-                  </pic:blipFill>
-                  <pic:spPr bwMode="auto">
-                    <a:xfrm>
-                      <a:off x="0" y="0"/>
-                      <a:ext cx="5334000" cy="2308746"/>
-                    </a:xfrm>
-                    <a:prstGeom prst="rect">
-                      <a:avLst/>
-                    </a:prstGeom>
-                    <a:noFill/>
-                    <a:ln w="9525">
-                      <a:noFill/>
-                      <a:headEnd/>
-                      <a:tailEnd/>
-                    </a:ln>
-                  </pic:spPr>
-                </pic:pic>
-              </a:graphicData>
-            </a:graphic>
-          </wp:inline>
-        </w:drawing>
       </w:r>
     </w:p>
     <w:p>
@@ -1571,47 +1276,6 @@
         <w:rPr>
           <w:noProof/>
         </w:rPr>
-        <w:drawing>
-          <wp:inline distT="0" distB="0" distL="0" distR="0" wp14:anchorId="092B2E82" wp14:editId="58A3EC58">
-            <wp:extent cx="4693920" cy="2452048"/>
-            <wp:effectExtent l="0" t="0" r="0" b="0"/>
-            <wp:docPr id="39" name="Picture"/>
-            <wp:cNvGraphicFramePr/>
-            <a:graphic xmlns:a="http://schemas.openxmlformats.org/drawingml/2006/main">
-              <a:graphicData uri="http://schemas.openxmlformats.org/drawingml/2006/picture">
-                <pic:pic xmlns:pic="http://schemas.openxmlformats.org/drawingml/2006/picture">
-                  <pic:nvPicPr>
-                    <pic:cNvPr id="40" name="Picture" descr="figures/fig9-tradeoff.png"/>
-                    <pic:cNvPicPr>
-                      <a:picLocks noChangeAspect="1" noChangeArrowheads="1"/>
-                    </pic:cNvPicPr>
-                  </pic:nvPicPr>
-                  <pic:blipFill>
-                    <a:blip r:embed="rId13"/>
-                    <a:stretch>
-                      <a:fillRect/>
-                    </a:stretch>
-                  </pic:blipFill>
-                  <pic:spPr bwMode="auto">
-                    <a:xfrm>
-                      <a:off x="0" y="0"/>
-                      <a:ext cx="4693920" cy="2452048"/>
-                    </a:xfrm>
-                    <a:prstGeom prst="rect">
-                      <a:avLst/>
-                    </a:prstGeom>
-                    <a:noFill/>
-                    <a:ln w="9525">
-                      <a:noFill/>
-                      <a:headEnd/>
-                      <a:tailEnd/>
-                    </a:ln>
-                  </pic:spPr>
-                </pic:pic>
-              </a:graphicData>
-            </a:graphic>
-          </wp:inline>
-        </w:drawing>
       </w:r>
     </w:p>
     <w:p>
@@ -1623,7 +1287,7 @@
           <w:i/>
           <w:iCs/>
         </w:rPr>
-        <w:t>Figure 9. Riders turned away per day against bikes moved per day, every schedule on the test year. The light blue curve raises the night budget from 1,000 to 9,000 bikes loaded or unloaded; the dark blue curve adds 14:00 visits to 25 to 400 stations on top of a budget of 3,000. The dashed line is what Citi Bike reports moving.</w:t>
+        <w:t>Figure 9. Riders turned away and bikes moved per day under each schedule, test year. The bar for never moving a bike is cut short; the dashed line is what Citi Bike reports moving.</w:t>
       </w:r>
     </w:p>
     <w:tbl>
@@ -1782,7 +1446,7 @@
               <w:jc w:val="right"/>
             </w:pPr>
             <w:r>
-              <w:t>4,733</w:t>
+              <w:t>4,732</w:t>
             </w:r>
           </w:p>
         </w:tc>
@@ -1924,7 +1588,7 @@
               <w:jc w:val="right"/>
             </w:pPr>
             <w:r>
-              <w:t>1,878</w:t>
+              <w:t>1,877</w:t>
             </w:r>
           </w:p>
         </w:tc>
@@ -2026,7 +1690,7 @@
               <w:jc w:val="right"/>
             </w:pPr>
             <w:r>
-              <w:t>870</w:t>
+              <w:t>869</w:t>
             </w:r>
           </w:p>
         </w:tc>
@@ -2141,7 +1805,7 @@
         <w:t>Forecasting is where the remaining gain is.</w:t>
       </w:r>
       <w:r>
-        <w:t xml:space="preserve"> With perfect knowledge of each day the same network would turn away 870 riders a day. The gap between 1,779 and 870 comes from day-to-day noise (Figure 5), not from the rule.</w:t>
+        <w:t xml:space="preserve"> With perfect knowledge of each day the same network would turn away 869 riders a day. The gap between 1,779 and 869 comes from day-to-day noise (Figure 5), not from the rule.</w:t>
       </w:r>
     </w:p>
     <w:p>
@@ -2166,7 +1830,6 @@
       <w:bookmarkStart w:id="6" w:name="Xe0e906fedbe19e5651ebbe1aea71b9f6ee14fa3"/>
       <w:bookmarkEnd w:id="5"/>
       <w:r>
-        <w:lastRenderedPageBreak/>
         <w:t>7. Where, when, and against Citi Bike’s own operations</w:t>
       </w:r>
     </w:p>
@@ -2175,50 +1838,17 @@
         <w:pStyle w:val="FirstParagraph"/>
       </w:pPr>
       <w:r>
+        <w:t>Section 6 picks the schedule. This section asks what it means on the street: which stations the vans visit, which problems are left, and whether the workload fits what Citi Bike does today.</w:t>
+      </w:r>
+    </w:p>
+    <w:p>
+      <w:pPr>
+        <w:pStyle w:val="FirstParagraph"/>
+      </w:pPr>
+      <w:r>
         <w:rPr>
           <w:noProof/>
         </w:rPr>
-        <w:drawing>
-          <wp:inline distT="0" distB="0" distL="0" distR="0" wp14:anchorId="23AED1E0" wp14:editId="04B6330E">
-            <wp:extent cx="2613660" cy="3354847"/>
-            <wp:effectExtent l="0" t="0" r="0" b="0"/>
-            <wp:docPr id="43" name="Picture"/>
-            <wp:cNvGraphicFramePr/>
-            <a:graphic xmlns:a="http://schemas.openxmlformats.org/drawingml/2006/main">
-              <a:graphicData uri="http://schemas.openxmlformats.org/drawingml/2006/picture">
-                <pic:pic xmlns:pic="http://schemas.openxmlformats.org/drawingml/2006/picture">
-                  <pic:nvPicPr>
-                    <pic:cNvPr id="44" name="Picture" descr="figures/fig10-where-vans-go.png"/>
-                    <pic:cNvPicPr>
-                      <a:picLocks noChangeAspect="1" noChangeArrowheads="1"/>
-                    </pic:cNvPicPr>
-                  </pic:nvPicPr>
-                  <pic:blipFill>
-                    <a:blip r:embed="rId14"/>
-                    <a:stretch>
-                      <a:fillRect/>
-                    </a:stretch>
-                  </pic:blipFill>
-                  <pic:spPr bwMode="auto">
-                    <a:xfrm>
-                      <a:off x="0" y="0"/>
-                      <a:ext cx="2613660" cy="3354847"/>
-                    </a:xfrm>
-                    <a:prstGeom prst="rect">
-                      <a:avLst/>
-                    </a:prstGeom>
-                    <a:noFill/>
-                    <a:ln w="9525">
-                      <a:noFill/>
-                      <a:headEnd/>
-                      <a:tailEnd/>
-                    </a:ln>
-                  </pic:spPr>
-                </pic:pic>
-              </a:graphicData>
-            </a:graphic>
-          </wp:inline>
-        </w:drawing>
       </w:r>
       <w:r>
         <w:t xml:space="preserve"> </w:t>
@@ -2227,47 +1857,6 @@
         <w:rPr>
           <w:noProof/>
         </w:rPr>
-        <w:drawing>
-          <wp:inline distT="0" distB="0" distL="0" distR="0" wp14:anchorId="5CD147CC" wp14:editId="63BC4149">
-            <wp:extent cx="2613660" cy="3354847"/>
-            <wp:effectExtent l="0" t="0" r="0" b="0"/>
-            <wp:docPr id="46" name="Picture"/>
-            <wp:cNvGraphicFramePr/>
-            <a:graphic xmlns:a="http://schemas.openxmlformats.org/drawingml/2006/main">
-              <a:graphicData uri="http://schemas.openxmlformats.org/drawingml/2006/picture">
-                <pic:pic xmlns:pic="http://schemas.openxmlformats.org/drawingml/2006/picture">
-                  <pic:nvPicPr>
-                    <pic:cNvPr id="47" name="Picture" descr="figures/fig11-shortages-left.png"/>
-                    <pic:cNvPicPr>
-                      <a:picLocks noChangeAspect="1" noChangeArrowheads="1"/>
-                    </pic:cNvPicPr>
-                  </pic:nvPicPr>
-                  <pic:blipFill>
-                    <a:blip r:embed="rId15"/>
-                    <a:stretch>
-                      <a:fillRect/>
-                    </a:stretch>
-                  </pic:blipFill>
-                  <pic:spPr bwMode="auto">
-                    <a:xfrm>
-                      <a:off x="0" y="0"/>
-                      <a:ext cx="2613660" cy="3354847"/>
-                    </a:xfrm>
-                    <a:prstGeom prst="rect">
-                      <a:avLst/>
-                    </a:prstGeom>
-                    <a:noFill/>
-                    <a:ln w="9525">
-                      <a:noFill/>
-                      <a:headEnd/>
-                      <a:tailEnd/>
-                    </a:ln>
-                  </pic:spPr>
-                </pic:pic>
-              </a:graphicData>
-            </a:graphic>
-          </wp:inline>
-        </w:drawing>
       </w:r>
     </w:p>
     <w:p>
@@ -2306,48 +1895,6 @@
         <w:rPr>
           <w:noProof/>
         </w:rPr>
-        <w:lastRenderedPageBreak/>
-        <w:drawing>
-          <wp:inline distT="0" distB="0" distL="0" distR="0" wp14:anchorId="4821881A" wp14:editId="496F2D94">
-            <wp:extent cx="2613660" cy="2262571"/>
-            <wp:effectExtent l="0" t="0" r="0" b="0"/>
-            <wp:docPr id="49" name="Picture"/>
-            <wp:cNvGraphicFramePr/>
-            <a:graphic xmlns:a="http://schemas.openxmlformats.org/drawingml/2006/main">
-              <a:graphicData uri="http://schemas.openxmlformats.org/drawingml/2006/picture">
-                <pic:pic xmlns:pic="http://schemas.openxmlformats.org/drawingml/2006/picture">
-                  <pic:nvPicPr>
-                    <pic:cNvPr id="50" name="Picture" descr="figures/fig12-shortages-by-hour.png"/>
-                    <pic:cNvPicPr>
-                      <a:picLocks noChangeAspect="1" noChangeArrowheads="1"/>
-                    </pic:cNvPicPr>
-                  </pic:nvPicPr>
-                  <pic:blipFill>
-                    <a:blip r:embed="rId16"/>
-                    <a:stretch>
-                      <a:fillRect/>
-                    </a:stretch>
-                  </pic:blipFill>
-                  <pic:spPr bwMode="auto">
-                    <a:xfrm>
-                      <a:off x="0" y="0"/>
-                      <a:ext cx="2613660" cy="2262571"/>
-                    </a:xfrm>
-                    <a:prstGeom prst="rect">
-                      <a:avLst/>
-                    </a:prstGeom>
-                    <a:noFill/>
-                    <a:ln w="9525">
-                      <a:noFill/>
-                      <a:headEnd/>
-                      <a:tailEnd/>
-                    </a:ln>
-                  </pic:spPr>
-                </pic:pic>
-              </a:graphicData>
-            </a:graphic>
-          </wp:inline>
-        </w:drawing>
       </w:r>
       <w:r>
         <w:t xml:space="preserve"> </w:t>
@@ -2356,47 +1903,6 @@
         <w:rPr>
           <w:noProof/>
         </w:rPr>
-        <w:drawing>
-          <wp:inline distT="0" distB="0" distL="0" distR="0" wp14:anchorId="49346254" wp14:editId="79AD0901">
-            <wp:extent cx="2613660" cy="2262571"/>
-            <wp:effectExtent l="0" t="0" r="0" b="0"/>
-            <wp:docPr id="52" name="Picture"/>
-            <wp:cNvGraphicFramePr/>
-            <a:graphic xmlns:a="http://schemas.openxmlformats.org/drawingml/2006/main">
-              <a:graphicData uri="http://schemas.openxmlformats.org/drawingml/2006/picture">
-                <pic:pic xmlns:pic="http://schemas.openxmlformats.org/drawingml/2006/picture">
-                  <pic:nvPicPr>
-                    <pic:cNvPr id="53" name="Picture" descr="figures/fig13-moves-vs-reported.png"/>
-                    <pic:cNvPicPr>
-                      <a:picLocks noChangeAspect="1" noChangeArrowheads="1"/>
-                    </pic:cNvPicPr>
-                  </pic:nvPicPr>
-                  <pic:blipFill>
-                    <a:blip r:embed="rId17"/>
-                    <a:stretch>
-                      <a:fillRect/>
-                    </a:stretch>
-                  </pic:blipFill>
-                  <pic:spPr bwMode="auto">
-                    <a:xfrm>
-                      <a:off x="0" y="0"/>
-                      <a:ext cx="2613660" cy="2262571"/>
-                    </a:xfrm>
-                    <a:prstGeom prst="rect">
-                      <a:avLst/>
-                    </a:prstGeom>
-                    <a:noFill/>
-                    <a:ln w="9525">
-                      <a:noFill/>
-                      <a:headEnd/>
-                      <a:tailEnd/>
-                    </a:ln>
-                  </pic:spPr>
-                </pic:pic>
-              </a:graphicData>
-            </a:graphic>
-          </wp:inline>
-        </w:drawing>
       </w:r>
     </w:p>
     <w:p>
@@ -2442,7 +1948,7 @@
         <w:pStyle w:val="FirstParagraph"/>
       </w:pPr>
       <w:r>
-        <w:t>Ranked by the riders each one stops turning away on the test year:</w:t>
+        <w:t>Sections 4 to 7 add up to five changes to how Citi Bike plans its nights, ranked by the riders each one stops turning away on the test year:</w:t>
       </w:r>
     </w:p>
     <w:p>
@@ -2515,7 +2021,6 @@
           <w:b/>
           <w:bCs/>
         </w:rPr>
-        <w:lastRenderedPageBreak/>
         <w:t>Cap the night at 3,000 bikes loaded or unloaded and take the moves that prevent the most shortages first.</w:t>
       </w:r>
       <w:r>
@@ -2556,7 +2061,7 @@
         <w:pStyle w:val="FirstParagraph"/>
       </w:pPr>
       <w:r>
-        <w:t>The shortage counts are lower bounds, since riders who gave up left no record. A rider who finds a full dock is counted and their bike leaves the simulation, while in reality they ride on to the next station; the depot then tops the network up, 527 bikes a day under the recommended schedule, so bikes moved are slightly overstated. Dock counts come from one day in October 2026 and are applied to both years, and the 81 stations without them are left out. The schedule ignores routing: the cost of a move depends on how far the van drives, and a vehicle-routing step (O’Mahony and Shmoys 2015) would turn the nightly list into routes. No public figure gives the cost of moving one bike, so every comparison is in bikes moved rather than dollars. Citi Bike’s Bike Angels programme, which pays riders to ride against the flow (Chung et al. 2018), also moves bikes at no truck cost; part of the budget could go to rider rewards. Finally, the gap to the ceiling (1,779 against 870 shortages a day) means better station-level forecasts, for example from events, school calendars or subway disruptions, are worth more than any further tuning of the rule.</w:t>
+        <w:t>These recommendations come from a simulation, and the simulation has limits. The shortage counts are lower bounds, since riders who gave up left no record. A rider who finds a full dock is counted and their bike leaves the simulation, while in reality they ride on to the next station; the depot then tops the network up, 527 bikes a day under the recommended schedule, so bikes moved are slightly overstated. Dock counts come from one day in October 2026 and are applied to both years, and the 81 stations without them are left out. The schedule ignores routing: the cost of a move depends on how far the van drives, and a vehicle-routing step (O’Mahony and Shmoys 2015) would turn the nightly list into routes. No public figure gives the cost of moving one bike, so every comparison is in bikes moved rather than dollars. Citi Bike’s Bike Angels programme, which pays riders to ride against the flow (Chung et al. 2018), also moves bikes at no truck cost; part of the budget could go to rider rewards. Finally, the gap to the ceiling (1,779 against 869 shortages a day) means better station-level forecasts, for example from events, school calendars or subway disruptions, are worth more than any further tuning of the rule.</w:t>
       </w:r>
     </w:p>
     <w:p>
@@ -2640,6 +2145,14 @@
         <w:pStyle w:val="BodyText"/>
       </w:pPr>
       <w:r>
+        <w:t>Citi Bike. (n.d.). Rebalancing the Citi Bike system. https://citibikenyc.com/blog/rebalancing-the-citi-bike-system</w:t>
+      </w:r>
+    </w:p>
+    <w:p>
+      <w:pPr>
+        <w:pStyle w:val="BodyText"/>
+      </w:pPr>
+      <w:r>
         <w:t>Gammelli, D., Wang, Y., Prak, D., Rodrigues, F., Minner, S., &amp; Pereira, F. C. (2021). Predictive and prescriptive performance of bike-sharing demand forecasts for inventory management. arXiv:2108.00858.</w:t>
       </w:r>
     </w:p>
@@ -2656,7 +2169,6 @@
         <w:pStyle w:val="BodyText"/>
       </w:pPr>
       <w:r>
-        <w:lastRenderedPageBreak/>
         <w:t>NYC Department of Transportation. (2025). Citi Bike expansion plan presentation, Bronx Community Board 8, 15 May 2025.</w:t>
       </w:r>
     </w:p>

</xml_diff>

<commit_message>
Put the figures back in the report docx
</commit_message>
<xml_diff>
--- a/report/final/citibike-report-editable.docx
+++ b/report/final/citibike-report-editable.docx
@@ -96,6 +96,7 @@
       <w:bookmarkStart w:id="1" w:name="data-assumptions-and-what-is-missing"/>
       <w:bookmarkEnd w:id="0"/>
       <w:r>
+        <w:lastRenderedPageBreak/>
         <w:br/>
       </w:r>
       <w:r>
@@ -488,6 +489,7 @@
           <w:b/>
           <w:bCs/>
         </w:rPr>
+        <w:lastRenderedPageBreak/>
         <w:t>Dock counts are from one day.</w:t>
       </w:r>
       <w:r>
@@ -539,6 +541,47 @@
         <w:rPr>
           <w:noProof/>
         </w:rPr>
+        <w:drawing>
+          <wp:inline distT="0" distB="0" distL="0" distR="0" wp14:anchorId="5495D299" wp14:editId="12BD249B">
+            <wp:extent cx="5334000" cy="2229134"/>
+            <wp:effectExtent l="0" t="0" r="0" b="0"/>
+            <wp:docPr id="12" name="Picture"/>
+            <wp:cNvGraphicFramePr/>
+            <a:graphic xmlns:a="http://schemas.openxmlformats.org/drawingml/2006/main">
+              <a:graphicData uri="http://schemas.openxmlformats.org/drawingml/2006/picture">
+                <pic:pic xmlns:pic="http://schemas.openxmlformats.org/drawingml/2006/picture">
+                  <pic:nvPicPr>
+                    <pic:cNvPr id="13" name="Picture" descr="figures/fig1-daily-rhythm.png"/>
+                    <pic:cNvPicPr>
+                      <a:picLocks noChangeAspect="1" noChangeArrowheads="1"/>
+                    </pic:cNvPicPr>
+                  </pic:nvPicPr>
+                  <pic:blipFill>
+                    <a:blip r:embed="rId5"/>
+                    <a:stretch>
+                      <a:fillRect/>
+                    </a:stretch>
+                  </pic:blipFill>
+                  <pic:spPr bwMode="auto">
+                    <a:xfrm>
+                      <a:off x="0" y="0"/>
+                      <a:ext cx="5334000" cy="2229134"/>
+                    </a:xfrm>
+                    <a:prstGeom prst="rect">
+                      <a:avLst/>
+                    </a:prstGeom>
+                    <a:noFill/>
+                    <a:ln w="9525">
+                      <a:noFill/>
+                      <a:headEnd/>
+                      <a:tailEnd/>
+                    </a:ln>
+                  </pic:spPr>
+                </pic:pic>
+              </a:graphicData>
+            </a:graphic>
+          </wp:inline>
+        </w:drawing>
       </w:r>
     </w:p>
     <w:p>
@@ -569,6 +612,47 @@
         <w:rPr>
           <w:noProof/>
         </w:rPr>
+        <w:drawing>
+          <wp:inline distT="0" distB="0" distL="0" distR="0" wp14:anchorId="7D320CCC" wp14:editId="0421DAAF">
+            <wp:extent cx="3947160" cy="2886729"/>
+            <wp:effectExtent l="0" t="0" r="0" b="0"/>
+            <wp:docPr id="15" name="Picture"/>
+            <wp:cNvGraphicFramePr/>
+            <a:graphic xmlns:a="http://schemas.openxmlformats.org/drawingml/2006/main">
+              <a:graphicData uri="http://schemas.openxmlformats.org/drawingml/2006/picture">
+                <pic:pic xmlns:pic="http://schemas.openxmlformats.org/drawingml/2006/picture">
+                  <pic:nvPicPr>
+                    <pic:cNvPr id="16" name="Picture" descr="figures/fig2-rush-map.png"/>
+                    <pic:cNvPicPr>
+                      <a:picLocks noChangeAspect="1" noChangeArrowheads="1"/>
+                    </pic:cNvPicPr>
+                  </pic:nvPicPr>
+                  <pic:blipFill>
+                    <a:blip r:embed="rId6"/>
+                    <a:stretch>
+                      <a:fillRect/>
+                    </a:stretch>
+                  </pic:blipFill>
+                  <pic:spPr bwMode="auto">
+                    <a:xfrm>
+                      <a:off x="0" y="0"/>
+                      <a:ext cx="3947160" cy="2886729"/>
+                    </a:xfrm>
+                    <a:prstGeom prst="rect">
+                      <a:avLst/>
+                    </a:prstGeom>
+                    <a:noFill/>
+                    <a:ln w="9525">
+                      <a:noFill/>
+                      <a:headEnd/>
+                      <a:tailEnd/>
+                    </a:ln>
+                  </pic:spPr>
+                </pic:pic>
+              </a:graphicData>
+            </a:graphic>
+          </wp:inline>
+        </w:drawing>
       </w:r>
     </w:p>
     <w:p>
@@ -580,6 +664,7 @@
           <w:i/>
           <w:iCs/>
         </w:rPr>
+        <w:lastRenderedPageBreak/>
         <w:t>Figure 2. Each station’s average net flow (bikes arriving minus bikes leaving) over the workday morning rush (07:00 to 10:00) and evening rush (16:00 to 19:00), development year. The colour scale stops at 15 bikes so smaller stations still show.</w:t>
       </w:r>
     </w:p>
@@ -599,6 +684,47 @@
         <w:rPr>
           <w:noProof/>
         </w:rPr>
+        <w:drawing>
+          <wp:inline distT="0" distB="0" distL="0" distR="0" wp14:anchorId="21CF26B2" wp14:editId="230C3A35">
+            <wp:extent cx="4480560" cy="2674961"/>
+            <wp:effectExtent l="0" t="0" r="0" b="0"/>
+            <wp:docPr id="18" name="Picture"/>
+            <wp:cNvGraphicFramePr/>
+            <a:graphic xmlns:a="http://schemas.openxmlformats.org/drawingml/2006/main">
+              <a:graphicData uri="http://schemas.openxmlformats.org/drawingml/2006/picture">
+                <pic:pic xmlns:pic="http://schemas.openxmlformats.org/drawingml/2006/picture">
+                  <pic:nvPicPr>
+                    <pic:cNvPr id="19" name="Picture" descr="figures/fig3-neighbourhood-clock.png"/>
+                    <pic:cNvPicPr>
+                      <a:picLocks noChangeAspect="1" noChangeArrowheads="1"/>
+                    </pic:cNvPicPr>
+                  </pic:nvPicPr>
+                  <pic:blipFill>
+                    <a:blip r:embed="rId7"/>
+                    <a:stretch>
+                      <a:fillRect/>
+                    </a:stretch>
+                  </pic:blipFill>
+                  <pic:spPr bwMode="auto">
+                    <a:xfrm>
+                      <a:off x="0" y="0"/>
+                      <a:ext cx="4480560" cy="2674961"/>
+                    </a:xfrm>
+                    <a:prstGeom prst="rect">
+                      <a:avLst/>
+                    </a:prstGeom>
+                    <a:noFill/>
+                    <a:ln w="9525">
+                      <a:noFill/>
+                      <a:headEnd/>
+                      <a:tailEnd/>
+                    </a:ln>
+                  </pic:spPr>
+                </pic:pic>
+              </a:graphicData>
+            </a:graphic>
+          </wp:inline>
+        </w:drawing>
       </w:r>
     </w:p>
     <w:p>
@@ -628,6 +754,7 @@
       <w:bookmarkStart w:id="3" w:name="can-it-be-planned-the-night-before"/>
       <w:bookmarkEnd w:id="2"/>
       <w:r>
+        <w:lastRenderedPageBreak/>
         <w:t>4. Can it be planned the night before?</w:t>
       </w:r>
     </w:p>
@@ -647,6 +774,47 @@
         <w:rPr>
           <w:noProof/>
         </w:rPr>
+        <w:drawing>
+          <wp:inline distT="0" distB="0" distL="0" distR="0" wp14:anchorId="2721B7EE" wp14:editId="5399F389">
+            <wp:extent cx="2240280" cy="2067951"/>
+            <wp:effectExtent l="0" t="0" r="0" b="0"/>
+            <wp:docPr id="22" name="Picture"/>
+            <wp:cNvGraphicFramePr/>
+            <a:graphic xmlns:a="http://schemas.openxmlformats.org/drawingml/2006/main">
+              <a:graphicData uri="http://schemas.openxmlformats.org/drawingml/2006/picture">
+                <pic:pic xmlns:pic="http://schemas.openxmlformats.org/drawingml/2006/picture">
+                  <pic:nvPicPr>
+                    <pic:cNvPr id="23" name="Picture" descr="figures/fig4-habit.png"/>
+                    <pic:cNvPicPr>
+                      <a:picLocks noChangeAspect="1" noChangeArrowheads="1"/>
+                    </pic:cNvPicPr>
+                  </pic:nvPicPr>
+                  <pic:blipFill>
+                    <a:blip r:embed="rId8"/>
+                    <a:stretch>
+                      <a:fillRect/>
+                    </a:stretch>
+                  </pic:blipFill>
+                  <pic:spPr bwMode="auto">
+                    <a:xfrm>
+                      <a:off x="0" y="0"/>
+                      <a:ext cx="2240280" cy="2067951"/>
+                    </a:xfrm>
+                    <a:prstGeom prst="rect">
+                      <a:avLst/>
+                    </a:prstGeom>
+                    <a:noFill/>
+                    <a:ln w="9525">
+                      <a:noFill/>
+                      <a:headEnd/>
+                      <a:tailEnd/>
+                    </a:ln>
+                  </pic:spPr>
+                </pic:pic>
+              </a:graphicData>
+            </a:graphic>
+          </wp:inline>
+        </w:drawing>
       </w:r>
       <w:r>
         <w:t xml:space="preserve"> </w:t>
@@ -655,6 +823,47 @@
         <w:rPr>
           <w:noProof/>
         </w:rPr>
+        <w:drawing>
+          <wp:inline distT="0" distB="0" distL="0" distR="0" wp14:anchorId="5420B2F3" wp14:editId="057DE880">
+            <wp:extent cx="2240280" cy="2067951"/>
+            <wp:effectExtent l="0" t="0" r="0" b="0"/>
+            <wp:docPr id="25" name="Picture"/>
+            <wp:cNvGraphicFramePr/>
+            <a:graphic xmlns:a="http://schemas.openxmlformats.org/drawingml/2006/main">
+              <a:graphicData uri="http://schemas.openxmlformats.org/drawingml/2006/picture">
+                <pic:pic xmlns:pic="http://schemas.openxmlformats.org/drawingml/2006/picture">
+                  <pic:nvPicPr>
+                    <pic:cNvPr id="26" name="Picture" descr="figures/fig5-single-day.png"/>
+                    <pic:cNvPicPr>
+                      <a:picLocks noChangeAspect="1" noChangeArrowheads="1"/>
+                    </pic:cNvPicPr>
+                  </pic:nvPicPr>
+                  <pic:blipFill>
+                    <a:blip r:embed="rId9"/>
+                    <a:stretch>
+                      <a:fillRect/>
+                    </a:stretch>
+                  </pic:blipFill>
+                  <pic:spPr bwMode="auto">
+                    <a:xfrm>
+                      <a:off x="0" y="0"/>
+                      <a:ext cx="2240280" cy="2067951"/>
+                    </a:xfrm>
+                    <a:prstGeom prst="rect">
+                      <a:avLst/>
+                    </a:prstGeom>
+                    <a:noFill/>
+                    <a:ln w="9525">
+                      <a:noFill/>
+                      <a:headEnd/>
+                      <a:tailEnd/>
+                    </a:ln>
+                  </pic:spPr>
+                </pic:pic>
+              </a:graphicData>
+            </a:graphic>
+          </wp:inline>
+        </w:drawing>
       </w:r>
     </w:p>
     <w:p>
@@ -711,6 +920,48 @@
         <w:rPr>
           <w:noProof/>
         </w:rPr>
+        <w:lastRenderedPageBreak/>
+        <w:drawing>
+          <wp:inline distT="0" distB="0" distL="0" distR="0" wp14:anchorId="4A4D3045" wp14:editId="0E41A2A2">
+            <wp:extent cx="2613660" cy="2340591"/>
+            <wp:effectExtent l="0" t="0" r="0" b="0"/>
+            <wp:docPr id="29" name="Picture"/>
+            <wp:cNvGraphicFramePr/>
+            <a:graphic xmlns:a="http://schemas.openxmlformats.org/drawingml/2006/main">
+              <a:graphicData uri="http://schemas.openxmlformats.org/drawingml/2006/picture">
+                <pic:pic xmlns:pic="http://schemas.openxmlformats.org/drawingml/2006/picture">
+                  <pic:nvPicPr>
+                    <pic:cNvPr id="30" name="Picture" descr="figures/fig6-demand-model.png"/>
+                    <pic:cNvPicPr>
+                      <a:picLocks noChangeAspect="1" noChangeArrowheads="1"/>
+                    </pic:cNvPicPr>
+                  </pic:nvPicPr>
+                  <pic:blipFill>
+                    <a:blip r:embed="rId10"/>
+                    <a:stretch>
+                      <a:fillRect/>
+                    </a:stretch>
+                  </pic:blipFill>
+                  <pic:spPr bwMode="auto">
+                    <a:xfrm>
+                      <a:off x="0" y="0"/>
+                      <a:ext cx="2613660" cy="2340591"/>
+                    </a:xfrm>
+                    <a:prstGeom prst="rect">
+                      <a:avLst/>
+                    </a:prstGeom>
+                    <a:noFill/>
+                    <a:ln w="9525">
+                      <a:noFill/>
+                      <a:headEnd/>
+                      <a:tailEnd/>
+                    </a:ln>
+                  </pic:spPr>
+                </pic:pic>
+              </a:graphicData>
+            </a:graphic>
+          </wp:inline>
+        </w:drawing>
       </w:r>
       <w:r>
         <w:t xml:space="preserve"> </w:t>
@@ -719,6 +970,47 @@
         <w:rPr>
           <w:noProof/>
         </w:rPr>
+        <w:drawing>
+          <wp:inline distT="0" distB="0" distL="0" distR="0" wp14:anchorId="0708D2FB" wp14:editId="7892AE83">
+            <wp:extent cx="2613660" cy="2028512"/>
+            <wp:effectExtent l="0" t="0" r="0" b="0"/>
+            <wp:docPr id="32" name="Picture"/>
+            <wp:cNvGraphicFramePr/>
+            <a:graphic xmlns:a="http://schemas.openxmlformats.org/drawingml/2006/main">
+              <a:graphicData uri="http://schemas.openxmlformats.org/drawingml/2006/picture">
+                <pic:pic xmlns:pic="http://schemas.openxmlformats.org/drawingml/2006/picture">
+                  <pic:nvPicPr>
+                    <pic:cNvPr id="33" name="Picture" descr="figures/fig7-demand-effects.png"/>
+                    <pic:cNvPicPr>
+                      <a:picLocks noChangeAspect="1" noChangeArrowheads="1"/>
+                    </pic:cNvPicPr>
+                  </pic:nvPicPr>
+                  <pic:blipFill>
+                    <a:blip r:embed="rId11"/>
+                    <a:stretch>
+                      <a:fillRect/>
+                    </a:stretch>
+                  </pic:blipFill>
+                  <pic:spPr bwMode="auto">
+                    <a:xfrm>
+                      <a:off x="0" y="0"/>
+                      <a:ext cx="2613660" cy="2028512"/>
+                    </a:xfrm>
+                    <a:prstGeom prst="rect">
+                      <a:avLst/>
+                    </a:prstGeom>
+                    <a:noFill/>
+                    <a:ln w="9525">
+                      <a:noFill/>
+                      <a:headEnd/>
+                      <a:tailEnd/>
+                    </a:ln>
+                  </pic:spPr>
+                </pic:pic>
+              </a:graphicData>
+            </a:graphic>
+          </wp:inline>
+        </w:drawing>
       </w:r>
     </w:p>
     <w:p>
@@ -1246,6 +1538,48 @@
         <w:rPr>
           <w:noProof/>
         </w:rPr>
+        <w:lastRenderedPageBreak/>
+        <w:drawing>
+          <wp:inline distT="0" distB="0" distL="0" distR="0" wp14:anchorId="2E3DD4CC" wp14:editId="15195DAB">
+            <wp:extent cx="5334000" cy="2308746"/>
+            <wp:effectExtent l="0" t="0" r="0" b="0"/>
+            <wp:docPr id="36" name="Picture"/>
+            <wp:cNvGraphicFramePr/>
+            <a:graphic xmlns:a="http://schemas.openxmlformats.org/drawingml/2006/main">
+              <a:graphicData uri="http://schemas.openxmlformats.org/drawingml/2006/picture">
+                <pic:pic xmlns:pic="http://schemas.openxmlformats.org/drawingml/2006/picture">
+                  <pic:nvPicPr>
+                    <pic:cNvPr id="37" name="Picture" descr="figures/fig8-one-day.png"/>
+                    <pic:cNvPicPr>
+                      <a:picLocks noChangeAspect="1" noChangeArrowheads="1"/>
+                    </pic:cNvPicPr>
+                  </pic:nvPicPr>
+                  <pic:blipFill>
+                    <a:blip r:embed="rId12"/>
+                    <a:stretch>
+                      <a:fillRect/>
+                    </a:stretch>
+                  </pic:blipFill>
+                  <pic:spPr bwMode="auto">
+                    <a:xfrm>
+                      <a:off x="0" y="0"/>
+                      <a:ext cx="5334000" cy="2308746"/>
+                    </a:xfrm>
+                    <a:prstGeom prst="rect">
+                      <a:avLst/>
+                    </a:prstGeom>
+                    <a:noFill/>
+                    <a:ln w="9525">
+                      <a:noFill/>
+                      <a:headEnd/>
+                      <a:tailEnd/>
+                    </a:ln>
+                  </pic:spPr>
+                </pic:pic>
+              </a:graphicData>
+            </a:graphic>
+          </wp:inline>
+        </w:drawing>
       </w:r>
     </w:p>
     <w:p>
@@ -1276,6 +1610,47 @@
         <w:rPr>
           <w:noProof/>
         </w:rPr>
+        <w:drawing>
+          <wp:inline distT="0" distB="0" distL="0" distR="0" wp14:anchorId="092B2E82" wp14:editId="58A3EC58">
+            <wp:extent cx="4693920" cy="1821521"/>
+            <wp:effectExtent l="0" t="0" r="0" b="0"/>
+            <wp:docPr id="39" name="Picture"/>
+            <wp:cNvGraphicFramePr/>
+            <a:graphic xmlns:a="http://schemas.openxmlformats.org/drawingml/2006/main">
+              <a:graphicData uri="http://schemas.openxmlformats.org/drawingml/2006/picture">
+                <pic:pic xmlns:pic="http://schemas.openxmlformats.org/drawingml/2006/picture">
+                  <pic:nvPicPr>
+                    <pic:cNvPr id="40" name="Picture" descr="figures/fig9-tradeoff.png"/>
+                    <pic:cNvPicPr>
+                      <a:picLocks noChangeAspect="1" noChangeArrowheads="1"/>
+                    </pic:cNvPicPr>
+                  </pic:nvPicPr>
+                  <pic:blipFill>
+                    <a:blip r:embed="rId13"/>
+                    <a:stretch>
+                      <a:fillRect/>
+                    </a:stretch>
+                  </pic:blipFill>
+                  <pic:spPr bwMode="auto">
+                    <a:xfrm>
+                      <a:off x="0" y="0"/>
+                      <a:ext cx="4693920" cy="1821521"/>
+                    </a:xfrm>
+                    <a:prstGeom prst="rect">
+                      <a:avLst/>
+                    </a:prstGeom>
+                    <a:noFill/>
+                    <a:ln w="9525">
+                      <a:noFill/>
+                      <a:headEnd/>
+                      <a:tailEnd/>
+                    </a:ln>
+                  </pic:spPr>
+                </pic:pic>
+              </a:graphicData>
+            </a:graphic>
+          </wp:inline>
+        </w:drawing>
       </w:r>
     </w:p>
     <w:p>
@@ -1830,6 +2205,7 @@
       <w:bookmarkStart w:id="6" w:name="Xe0e906fedbe19e5651ebbe1aea71b9f6ee14fa3"/>
       <w:bookmarkEnd w:id="5"/>
       <w:r>
+        <w:lastRenderedPageBreak/>
         <w:t>7. Where, when, and against Citi Bike’s own operations</w:t>
       </w:r>
     </w:p>
@@ -1849,6 +2225,47 @@
         <w:rPr>
           <w:noProof/>
         </w:rPr>
+        <w:drawing>
+          <wp:inline distT="0" distB="0" distL="0" distR="0" wp14:anchorId="23AED1E0" wp14:editId="04B6330E">
+            <wp:extent cx="2613660" cy="3354847"/>
+            <wp:effectExtent l="0" t="0" r="0" b="0"/>
+            <wp:docPr id="43" name="Picture"/>
+            <wp:cNvGraphicFramePr/>
+            <a:graphic xmlns:a="http://schemas.openxmlformats.org/drawingml/2006/main">
+              <a:graphicData uri="http://schemas.openxmlformats.org/drawingml/2006/picture">
+                <pic:pic xmlns:pic="http://schemas.openxmlformats.org/drawingml/2006/picture">
+                  <pic:nvPicPr>
+                    <pic:cNvPr id="44" name="Picture" descr="figures/fig10-where-vans-go.png"/>
+                    <pic:cNvPicPr>
+                      <a:picLocks noChangeAspect="1" noChangeArrowheads="1"/>
+                    </pic:cNvPicPr>
+                  </pic:nvPicPr>
+                  <pic:blipFill>
+                    <a:blip r:embed="rId14"/>
+                    <a:stretch>
+                      <a:fillRect/>
+                    </a:stretch>
+                  </pic:blipFill>
+                  <pic:spPr bwMode="auto">
+                    <a:xfrm>
+                      <a:off x="0" y="0"/>
+                      <a:ext cx="2613660" cy="3354847"/>
+                    </a:xfrm>
+                    <a:prstGeom prst="rect">
+                      <a:avLst/>
+                    </a:prstGeom>
+                    <a:noFill/>
+                    <a:ln w="9525">
+                      <a:noFill/>
+                      <a:headEnd/>
+                      <a:tailEnd/>
+                    </a:ln>
+                  </pic:spPr>
+                </pic:pic>
+              </a:graphicData>
+            </a:graphic>
+          </wp:inline>
+        </w:drawing>
       </w:r>
       <w:r>
         <w:t xml:space="preserve"> </w:t>
@@ -1857,6 +2274,47 @@
         <w:rPr>
           <w:noProof/>
         </w:rPr>
+        <w:drawing>
+          <wp:inline distT="0" distB="0" distL="0" distR="0" wp14:anchorId="5CD147CC" wp14:editId="63BC4149">
+            <wp:extent cx="2613660" cy="3354847"/>
+            <wp:effectExtent l="0" t="0" r="0" b="0"/>
+            <wp:docPr id="46" name="Picture"/>
+            <wp:cNvGraphicFramePr/>
+            <a:graphic xmlns:a="http://schemas.openxmlformats.org/drawingml/2006/main">
+              <a:graphicData uri="http://schemas.openxmlformats.org/drawingml/2006/picture">
+                <pic:pic xmlns:pic="http://schemas.openxmlformats.org/drawingml/2006/picture">
+                  <pic:nvPicPr>
+                    <pic:cNvPr id="47" name="Picture" descr="figures/fig11-shortages-left.png"/>
+                    <pic:cNvPicPr>
+                      <a:picLocks noChangeAspect="1" noChangeArrowheads="1"/>
+                    </pic:cNvPicPr>
+                  </pic:nvPicPr>
+                  <pic:blipFill>
+                    <a:blip r:embed="rId15"/>
+                    <a:stretch>
+                      <a:fillRect/>
+                    </a:stretch>
+                  </pic:blipFill>
+                  <pic:spPr bwMode="auto">
+                    <a:xfrm>
+                      <a:off x="0" y="0"/>
+                      <a:ext cx="2613660" cy="3354847"/>
+                    </a:xfrm>
+                    <a:prstGeom prst="rect">
+                      <a:avLst/>
+                    </a:prstGeom>
+                    <a:noFill/>
+                    <a:ln w="9525">
+                      <a:noFill/>
+                      <a:headEnd/>
+                      <a:tailEnd/>
+                    </a:ln>
+                  </pic:spPr>
+                </pic:pic>
+              </a:graphicData>
+            </a:graphic>
+          </wp:inline>
+        </w:drawing>
       </w:r>
     </w:p>
     <w:p>
@@ -1895,6 +2353,48 @@
         <w:rPr>
           <w:noProof/>
         </w:rPr>
+        <w:lastRenderedPageBreak/>
+        <w:drawing>
+          <wp:inline distT="0" distB="0" distL="0" distR="0" wp14:anchorId="4821881A" wp14:editId="496F2D94">
+            <wp:extent cx="2613660" cy="2262571"/>
+            <wp:effectExtent l="0" t="0" r="0" b="0"/>
+            <wp:docPr id="49" name="Picture"/>
+            <wp:cNvGraphicFramePr/>
+            <a:graphic xmlns:a="http://schemas.openxmlformats.org/drawingml/2006/main">
+              <a:graphicData uri="http://schemas.openxmlformats.org/drawingml/2006/picture">
+                <pic:pic xmlns:pic="http://schemas.openxmlformats.org/drawingml/2006/picture">
+                  <pic:nvPicPr>
+                    <pic:cNvPr id="50" name="Picture" descr="figures/fig12-shortages-by-hour.png"/>
+                    <pic:cNvPicPr>
+                      <a:picLocks noChangeAspect="1" noChangeArrowheads="1"/>
+                    </pic:cNvPicPr>
+                  </pic:nvPicPr>
+                  <pic:blipFill>
+                    <a:blip r:embed="rId16"/>
+                    <a:stretch>
+                      <a:fillRect/>
+                    </a:stretch>
+                  </pic:blipFill>
+                  <pic:spPr bwMode="auto">
+                    <a:xfrm>
+                      <a:off x="0" y="0"/>
+                      <a:ext cx="2613660" cy="2262571"/>
+                    </a:xfrm>
+                    <a:prstGeom prst="rect">
+                      <a:avLst/>
+                    </a:prstGeom>
+                    <a:noFill/>
+                    <a:ln w="9525">
+                      <a:noFill/>
+                      <a:headEnd/>
+                      <a:tailEnd/>
+                    </a:ln>
+                  </pic:spPr>
+                </pic:pic>
+              </a:graphicData>
+            </a:graphic>
+          </wp:inline>
+        </w:drawing>
       </w:r>
       <w:r>
         <w:t xml:space="preserve"> </w:t>
@@ -1903,6 +2403,47 @@
         <w:rPr>
           <w:noProof/>
         </w:rPr>
+        <w:drawing>
+          <wp:inline distT="0" distB="0" distL="0" distR="0" wp14:anchorId="49346254" wp14:editId="79AD0901">
+            <wp:extent cx="2613660" cy="2262571"/>
+            <wp:effectExtent l="0" t="0" r="0" b="0"/>
+            <wp:docPr id="52" name="Picture"/>
+            <wp:cNvGraphicFramePr/>
+            <a:graphic xmlns:a="http://schemas.openxmlformats.org/drawingml/2006/main">
+              <a:graphicData uri="http://schemas.openxmlformats.org/drawingml/2006/picture">
+                <pic:pic xmlns:pic="http://schemas.openxmlformats.org/drawingml/2006/picture">
+                  <pic:nvPicPr>
+                    <pic:cNvPr id="53" name="Picture" descr="figures/fig13-moves-vs-reported.png"/>
+                    <pic:cNvPicPr>
+                      <a:picLocks noChangeAspect="1" noChangeArrowheads="1"/>
+                    </pic:cNvPicPr>
+                  </pic:nvPicPr>
+                  <pic:blipFill>
+                    <a:blip r:embed="rId17"/>
+                    <a:stretch>
+                      <a:fillRect/>
+                    </a:stretch>
+                  </pic:blipFill>
+                  <pic:spPr bwMode="auto">
+                    <a:xfrm>
+                      <a:off x="0" y="0"/>
+                      <a:ext cx="2613660" cy="2262571"/>
+                    </a:xfrm>
+                    <a:prstGeom prst="rect">
+                      <a:avLst/>
+                    </a:prstGeom>
+                    <a:noFill/>
+                    <a:ln w="9525">
+                      <a:noFill/>
+                      <a:headEnd/>
+                      <a:tailEnd/>
+                    </a:ln>
+                  </pic:spPr>
+                </pic:pic>
+              </a:graphicData>
+            </a:graphic>
+          </wp:inline>
+        </w:drawing>
       </w:r>
     </w:p>
     <w:p>
@@ -2021,6 +2562,7 @@
           <w:b/>
           <w:bCs/>
         </w:rPr>
+        <w:lastRenderedPageBreak/>
         <w:t>Cap the night at 3,000 bikes loaded or unloaded and take the moves that prevent the most shortages first.</w:t>
       </w:r>
       <w:r>
@@ -2169,6 +2711,7 @@
         <w:pStyle w:val="BodyText"/>
       </w:pPr>
       <w:r>
+        <w:lastRenderedPageBreak/>
         <w:t>NYC Department of Transportation. (2025). Citi Bike expansion plan presentation, Bronx Community Board 8, 15 May 2025.</w:t>
       </w:r>
     </w:p>

</xml_diff>